<commit_message>
feat: Actualizacion de reuniones y requisitos técnicos
</commit_message>
<xml_diff>
--- a/wiki/docs/registro_reuniones.docx
+++ b/wiki/docs/registro_reuniones.docx
@@ -174,7 +174,41 @@
           <w:sz w:val="24"/>
           <w:lang w:val="es-ES" w:eastAsia="en-US" w:bidi="ar-SA"/>
         </w:rPr>
-        <w:t>OTROS</w:t>
+        <w:t>Alexis Daniel Ruiz Salazar</w:t>
+      </w:r>
+    </w:p>
+    <w:p>
+      <w:pPr>
+        <w:pStyle w:val="Normal"/>
+        <w:spacing w:lineRule="auto" w:line="360" w:before="0" w:after="120"/>
+        <w:rPr>
+          <w:lang w:val="es-ES" w:eastAsia="en-US" w:bidi="ar-SA"/>
+        </w:rPr>
+      </w:pPr>
+      <w:r>
+        <w:rPr>
+          <w:rFonts w:eastAsia="Times New Roman" w:ascii="Times New Roman" w:hAnsi="Times New Roman"/>
+          <w:sz w:val="24"/>
+          <w:lang w:val="es-ES" w:eastAsia="en-US" w:bidi="ar-SA"/>
+        </w:rPr>
+        <w:t>Luis Guillermo Colmenares Torres</w:t>
+      </w:r>
+    </w:p>
+    <w:p>
+      <w:pPr>
+        <w:pStyle w:val="Normal"/>
+        <w:spacing w:lineRule="auto" w:line="360" w:before="0" w:after="120"/>
+        <w:rPr>
+          <w:lang w:val="es-ES" w:eastAsia="en-US" w:bidi="ar-SA"/>
+        </w:rPr>
+      </w:pPr>
+      <w:r>
+        <w:rPr>
+          <w:rFonts w:eastAsia="Times New Roman" w:ascii="Times New Roman" w:hAnsi="Times New Roman"/>
+          <w:sz w:val="24"/>
+          <w:lang w:val="es-ES" w:eastAsia="en-US" w:bidi="ar-SA"/>
+        </w:rPr>
+        <w:t>Maurizio Giovanni Hernández Camisa</w:t>
       </w:r>
     </w:p>
     <w:p>
@@ -208,7 +242,97 @@
           <w:sz w:val="24"/>
           <w:lang w:val="es-ES" w:eastAsia="en-US" w:bidi="ar-SA"/>
         </w:rPr>
-        <w:t>Profesorado Wilme R.</w:t>
+        <w:t>W</w:t>
+      </w:r>
+      <w:r>
+        <w:rPr>
+          <w:rFonts w:eastAsia="Times New Roman" w:ascii="Times New Roman" w:hAnsi="Times New Roman"/>
+          <w:sz w:val="24"/>
+          <w:lang w:val="es-ES" w:eastAsia="en-US" w:bidi="ar-SA"/>
+        </w:rPr>
+        <w:t>ilme</w:t>
+      </w:r>
+      <w:r>
+        <w:rPr>
+          <w:rFonts w:eastAsia="Times New Roman" w:ascii="Times New Roman" w:hAnsi="Times New Roman"/>
+          <w:sz w:val="24"/>
+          <w:lang w:val="es-ES" w:eastAsia="en-US" w:bidi="ar-SA"/>
+        </w:rPr>
+        <w:t xml:space="preserve"> </w:t>
+      </w:r>
+      <w:r>
+        <w:rPr>
+          <w:rFonts w:eastAsia="Times New Roman" w:ascii="Times New Roman" w:hAnsi="Times New Roman"/>
+          <w:sz w:val="24"/>
+          <w:lang w:val="es-ES" w:eastAsia="en-US" w:bidi="ar-SA"/>
+        </w:rPr>
+        <w:t>Fernando</w:t>
+      </w:r>
+      <w:r>
+        <w:rPr>
+          <w:rFonts w:eastAsia="Times New Roman" w:ascii="Times New Roman" w:hAnsi="Times New Roman"/>
+          <w:sz w:val="24"/>
+          <w:lang w:val="es-ES" w:eastAsia="en-US" w:bidi="ar-SA"/>
+        </w:rPr>
+        <w:t xml:space="preserve"> </w:t>
+      </w:r>
+      <w:r>
+        <w:rPr>
+          <w:rFonts w:eastAsia="Times New Roman" w:ascii="Times New Roman" w:hAnsi="Times New Roman"/>
+          <w:sz w:val="24"/>
+          <w:lang w:val="es-ES" w:eastAsia="en-US" w:bidi="ar-SA"/>
+        </w:rPr>
+        <w:t>Rodriguez</w:t>
+      </w:r>
+      <w:r>
+        <w:rPr>
+          <w:rFonts w:eastAsia="Times New Roman" w:ascii="Times New Roman" w:hAnsi="Times New Roman"/>
+          <w:sz w:val="24"/>
+          <w:lang w:val="es-ES" w:eastAsia="en-US" w:bidi="ar-SA"/>
+        </w:rPr>
+        <w:t xml:space="preserve"> </w:t>
+      </w:r>
+      <w:r>
+        <w:rPr>
+          <w:rFonts w:eastAsia="Times New Roman" w:ascii="Times New Roman" w:hAnsi="Times New Roman"/>
+          <w:sz w:val="24"/>
+          <w:lang w:val="es-ES" w:eastAsia="en-US" w:bidi="ar-SA"/>
+        </w:rPr>
+        <w:t>Paz</w:t>
+      </w:r>
+    </w:p>
+    <w:p>
+      <w:pPr>
+        <w:pStyle w:val="Normal"/>
+        <w:spacing w:lineRule="auto" w:line="360" w:before="0" w:after="120"/>
+        <w:rPr>
+          <w:lang w:val="es-ES" w:eastAsia="en-US" w:bidi="ar-SA"/>
+        </w:rPr>
+      </w:pPr>
+      <w:r>
+        <w:rPr>
+          <w:rFonts w:eastAsia="Times New Roman" w:ascii="Times New Roman" w:hAnsi="Times New Roman"/>
+          <w:sz w:val="24"/>
+          <w:lang w:val="es-ES" w:eastAsia="en-US" w:bidi="ar-SA"/>
+        </w:rPr>
+        <w:t>Tanausú Castrillo Estévez</w:t>
+      </w:r>
+    </w:p>
+    <w:p>
+      <w:pPr>
+        <w:pStyle w:val="Normal"/>
+        <w:spacing w:lineRule="auto" w:line="360" w:before="0" w:after="120"/>
+        <w:rPr>
+          <w:lang w:val="es-ES" w:eastAsia="en-US" w:bidi="ar-SA"/>
+        </w:rPr>
+      </w:pPr>
+      <w:r>
+        <w:rPr>
+          <w:rFonts w:eastAsia="Times New Roman" w:ascii="Times New Roman" w:hAnsi="Times New Roman"/>
+          <w:sz w:val="24"/>
+          <w:lang w:val="es-ES" w:eastAsia="en-US" w:bidi="ar-SA"/>
+        </w:rPr>
+        <w:t xml:space="preserve">Samara Albertos Blanchard </w:t>
       </w:r>
     </w:p>
     <w:p>
@@ -589,7 +713,7 @@
         </w:rPr>
         <w:t xml:space="preserve"> para preparar su clase, basado en el inventario disponible y los faltantes solicitados al proveedor.</w:t>
         <w:br/>
-        <w:t>🔸</w:t>
+        <w:t xml:space="preserve">- </w:t>
       </w:r>
       <w:r>
         <w:rPr>
@@ -685,7 +809,7 @@
         <w:br/>
         <w:t>Se mencionó la necesidad de tener en cuenta las temperaturas de almacenamiento.</w:t>
         <w:br/>
-        <w:t xml:space="preserve">🔸 </w:t>
+        <w:t xml:space="preserve">- </w:t>
       </w:r>
       <w:r>
         <w:rPr>
@@ -747,7 +871,7 @@
         </w:rPr>
         <w:t>.</w:t>
         <w:br/>
-        <w:t xml:space="preserve">🔸 </w:t>
+        <w:t xml:space="preserve">- </w:t>
       </w:r>
       <w:r>
         <w:rPr>
@@ -1100,7 +1224,7 @@
         </w:rPr>
         <w:t>.</w:t>
         <w:br/>
-        <w:t xml:space="preserve">🔸 </w:t>
+        <w:t xml:space="preserve">- </w:t>
       </w:r>
       <w:r>
         <w:rPr>
@@ -1109,7 +1233,16 @@
           <w:sz w:val="24"/>
           <w:lang w:val="es-ES" w:eastAsia="en-US" w:bidi="ar-SA"/>
         </w:rPr>
-        <w:t>Se debe precisar el rango horario exacto.</w:t>
+        <w:t xml:space="preserve">Se debe precisar el rango horario exacto, </w:t>
+      </w:r>
+      <w:r>
+        <w:rPr>
+          <w:rStyle w:val="Emphasis"/>
+          <w:rFonts w:eastAsia="Times New Roman" w:ascii="Times New Roman" w:hAnsi="Times New Roman"/>
+          <w:sz w:val="24"/>
+          <w:lang w:val="es-ES" w:eastAsia="en-US" w:bidi="ar-SA"/>
+        </w:rPr>
+        <w:t xml:space="preserve">aunque se mencionó que los pedidos pueden ser solicitados hasta las 23:55 de ese mismo día. </w:t>
       </w:r>
     </w:p>
     <w:p>

</xml_diff>